<commit_message>
feat: harden app for private beta
</commit_message>
<xml_diff>
--- a/docs/Little-Gains-Product-Roadmap-and-Checklist.docx
+++ b/docs/Little-Gains-Product-Roadmap-and-Checklist.docx
@@ -233,7 +233,7 @@
                 <w:color w:val="285A36"/>
                 <w:sz w:val="19"/>
               </w:rPr>
-              <w:t>Prepared</w:t>
+              <w:t>Last updated</w:t>
             </w:r>
           </w:p>
         </w:tc>
@@ -259,7 +259,7 @@
                 <w:color w:val="243128"/>
                 <w:sz w:val="19"/>
               </w:rPr>
-              <w:t>28 August 2026</w:t>
+              <w:t>29 August 2026</w:t>
             </w:r>
           </w:p>
         </w:tc>
@@ -318,7 +318,7 @@
                 <w:color w:val="243128"/>
                 <w:sz w:val="19"/>
               </w:rPr>
-              <w:t>Stage 2 complete; encrypted native journey validated</w:t>
+              <w:t>Phase 4 implementation approved; reminder trial and usability validation remain open</w:t>
             </w:r>
           </w:p>
         </w:tc>
@@ -387,7 +387,7 @@
                 <w:color w:val="D98D36"/>
                 <w:sz w:val="21"/>
               </w:rPr>
-              <w:t xml:space="preserve">NEXT RECOMMENDED PHASE  </w:t>
+              <w:t xml:space="preserve">NEXT RECOMMENDED PHASE  Defer optional calendar awareness and proceed to Phase 6 quality hardening and private-beta preparation while completing the reminder trial and five-user usability validation.</w:t>
             </w:r>
             <w:r>
               <w:rPr>
@@ -395,7 +395,7 @@
                 <w:color w:val="243128"/>
                 <w:sz w:val="21"/>
               </w:rPr>
-              <w:t>Build reminder preferences and local notification scheduling first. Prove that prompts are timely and respectful before adding Outlook or device-calendar access.</w:t>
+              <w:t/>
             </w:r>
           </w:p>
         </w:tc>
@@ -589,7 +589,7 @@
                 <w:color w:val="285A36"/>
                 <w:sz w:val="21"/>
               </w:rPr>
-              <w:t xml:space="preserve">STATUS  </w:t>
+              <w:t xml:space="preserve">STATUS  The core journey, reminders, routine editing, reflection, and personalization are implemented and verified on a connected Samsung device. The encrypted database and history survive restart and upgrade.</w:t>
             </w:r>
             <w:r>
               <w:rPr>
@@ -597,7 +597,7 @@
                 <w:color w:val="243128"/>
                 <w:sz w:val="21"/>
               </w:rPr>
-              <w:t>The core mobile habit journey is complete and verified on a connected Samsung device. The native database is encrypted, onboarding persists, and completed habits survive restart.</w:t>
+              <w:t/>
             </w:r>
           </w:p>
         </w:tc>
@@ -745,7 +745,7 @@
           <w:color w:val="243128"/>
           <w:sz w:val="21"/>
         </w:rPr>
-        <w:t>Notifications and notification actions are not implemented yet.</w:t>
+        <w:t>The one-week reminder usefulness trial remains open.</w:t>
       </w:r>
     </w:p>
     <w:p>
@@ -759,7 +759,7 @@
           <w:color w:val="243128"/>
           <w:sz w:val="21"/>
         </w:rPr>
-        <w:t>Routine details cannot yet be edited after onboarding.</w:t>
+        <w:t>Five-user routine-editing and reflection validation remains open.</w:t>
       </w:r>
     </w:p>
     <w:p>
@@ -1159,7 +1159,7 @@
                 <w:color w:val="285A36"/>
                 <w:sz w:val="17"/>
               </w:rPr>
-              <w:t>Next</w:t>
+              <w:t>Implemented</w:t>
             </w:r>
           </w:p>
         </w:tc>
@@ -1201,7 +1201,7 @@
                 <w:color w:val="243128"/>
                 <w:sz w:val="17"/>
               </w:rPr>
-              <w:t>Prompts are configurable, reliable, and non-intrusive</w:t>
+              <w:t>Technical checks pass; one-week trial open</w:t>
             </w:r>
           </w:p>
         </w:tc>
@@ -1250,7 +1250,7 @@
                 <w:color w:val="243128"/>
                 <w:sz w:val="17"/>
               </w:rPr>
-              <w:t>Pending</w:t>
+              <w:t>Implemented</w:t>
             </w:r>
           </w:p>
         </w:tc>
@@ -1294,7 +1294,7 @@
                 <w:color w:val="243128"/>
                 <w:sz w:val="17"/>
               </w:rPr>
-              <w:t>Routine editing and weekly reflection validated</w:t>
+              <w:t>Implementation approved; five-user trial open</w:t>
             </w:r>
           </w:p>
         </w:tc>
@@ -1341,7 +1341,7 @@
                 <w:color w:val="243128"/>
                 <w:sz w:val="17"/>
               </w:rPr>
-              <w:t>Optional</w:t>
+              <w:t>Deferred</w:t>
             </w:r>
           </w:p>
         </w:tc>
@@ -1432,7 +1432,7 @@
                 <w:color w:val="243128"/>
                 <w:sz w:val="17"/>
               </w:rPr>
-              <w:t>Pending</w:t>
+              <w:t>In progress</w:t>
             </w:r>
           </w:p>
         </w:tc>
@@ -1689,7 +1689,7 @@
           <w:color w:val="285A36"/>
           <w:sz w:val="21"/>
         </w:rPr>
-        <w:t xml:space="preserve">Status: </w:t>
+        <w:t xml:space="preserve">Status: IMPLEMENTED AND APPROVED - one-week trial open</w:t>
       </w:r>
       <w:r>
         <w:rPr>
@@ -1697,7 +1697,7 @@
           <w:color w:val="243128"/>
           <w:sz w:val="21"/>
         </w:rPr>
-        <w:t>NEXT - requires approval before implementation</w:t>
+        <w:t/>
       </w:r>
     </w:p>
     <w:p>
@@ -2016,7 +2016,7 @@
                 <w:color w:val="243128"/>
                 <w:sz w:val="17"/>
               </w:rPr>
-              <w:t>TO DO</w:t>
+              <w:t>DONE</w:t>
             </w:r>
           </w:p>
         </w:tc>
@@ -2085,7 +2085,7 @@
                 <w:color w:val="243128"/>
                 <w:sz w:val="17"/>
               </w:rPr>
-              <w:t>TO DO</w:t>
+              <w:t>DONE</w:t>
             </w:r>
           </w:p>
         </w:tc>
@@ -2155,7 +2155,7 @@
                 <w:color w:val="243128"/>
                 <w:sz w:val="17"/>
               </w:rPr>
-              <w:t>TO DO</w:t>
+              <w:t>DONE</w:t>
             </w:r>
           </w:p>
         </w:tc>
@@ -2224,7 +2224,7 @@
                 <w:color w:val="243128"/>
                 <w:sz w:val="17"/>
               </w:rPr>
-              <w:t>TO DO</w:t>
+              <w:t>DONE</w:t>
             </w:r>
           </w:p>
         </w:tc>
@@ -2294,7 +2294,7 @@
                 <w:color w:val="243128"/>
                 <w:sz w:val="17"/>
               </w:rPr>
-              <w:t>TO DO</w:t>
+              <w:t>DONE</w:t>
             </w:r>
           </w:p>
         </w:tc>
@@ -2363,7 +2363,7 @@
                 <w:color w:val="243128"/>
                 <w:sz w:val="17"/>
               </w:rPr>
-              <w:t>TO DO</w:t>
+              <w:t>DONE</w:t>
             </w:r>
           </w:p>
         </w:tc>
@@ -2433,7 +2433,7 @@
                 <w:color w:val="243128"/>
                 <w:sz w:val="17"/>
               </w:rPr>
-              <w:t>TO DO</w:t>
+              <w:t>DONE</w:t>
             </w:r>
           </w:p>
         </w:tc>
@@ -2502,7 +2502,7 @@
                 <w:color w:val="243128"/>
                 <w:sz w:val="17"/>
               </w:rPr>
-              <w:t>TO DO</w:t>
+              <w:t>DONE</w:t>
             </w:r>
           </w:p>
         </w:tc>
@@ -2572,7 +2572,7 @@
                 <w:color w:val="243128"/>
                 <w:sz w:val="17"/>
               </w:rPr>
-              <w:t>TO DO</w:t>
+              <w:t>DONE</w:t>
             </w:r>
           </w:p>
         </w:tc>
@@ -2677,7 +2677,7 @@
                 <w:color w:val="285A36"/>
                 <w:sz w:val="21"/>
               </w:rPr>
-              <w:t xml:space="preserve">APPROVAL CHECK  </w:t>
+              <w:t xml:space="preserve">APPROVAL CHECK  Implementation is approved. Close after a one-week trial confirms reminders are easy to disable, stay inside allowed windows, recover reliably, and feel helpful.</w:t>
             </w:r>
             <w:r>
               <w:rPr>
@@ -2685,7 +2685,7 @@
                 <w:color w:val="243128"/>
                 <w:sz w:val="21"/>
               </w:rPr>
-              <w:t>Proceed only when reminders can be turned off easily, never fire outside allowed windows, survive restart and timezone changes, and feel helpful during a one-week personal trial.</w:t>
+              <w:t/>
             </w:r>
           </w:p>
         </w:tc>
@@ -2731,7 +2731,7 @@
           <w:color w:val="285A36"/>
           <w:sz w:val="21"/>
         </w:rPr>
-        <w:t xml:space="preserve">Status: </w:t>
+        <w:t xml:space="preserve">Status: IMPLEMENTED AND APPROVED - five-user validation open</w:t>
       </w:r>
       <w:r>
         <w:rPr>
@@ -2739,7 +2739,7 @@
           <w:color w:val="243128"/>
           <w:sz w:val="21"/>
         </w:rPr>
-        <w:t>PENDING - begins only after Phase 3 approval</w:t>
+        <w:t/>
       </w:r>
     </w:p>
     <w:p>
@@ -2967,7 +2967,7 @@
                 <w:color w:val="243128"/>
                 <w:sz w:val="17"/>
               </w:rPr>
-              <w:t>TO DO</w:t>
+              <w:t>DONE</w:t>
             </w:r>
           </w:p>
         </w:tc>
@@ -3036,7 +3036,7 @@
                 <w:color w:val="243128"/>
                 <w:sz w:val="17"/>
               </w:rPr>
-              <w:t>TO DO</w:t>
+              <w:t>DONE</w:t>
             </w:r>
           </w:p>
         </w:tc>
@@ -3106,7 +3106,7 @@
                 <w:color w:val="243128"/>
                 <w:sz w:val="17"/>
               </w:rPr>
-              <w:t>TO DO</w:t>
+              <w:t>DONE</w:t>
             </w:r>
           </w:p>
         </w:tc>
@@ -3175,7 +3175,7 @@
                 <w:color w:val="243128"/>
                 <w:sz w:val="17"/>
               </w:rPr>
-              <w:t>TO DO</w:t>
+              <w:t>DONE</w:t>
             </w:r>
           </w:p>
         </w:tc>
@@ -3245,7 +3245,7 @@
                 <w:color w:val="243128"/>
                 <w:sz w:val="17"/>
               </w:rPr>
-              <w:t>TO DO</w:t>
+              <w:t>DONE</w:t>
             </w:r>
           </w:p>
         </w:tc>
@@ -3314,7 +3314,7 @@
                 <w:color w:val="243128"/>
                 <w:sz w:val="17"/>
               </w:rPr>
-              <w:t>TO DO</w:t>
+              <w:t>DONE</w:t>
             </w:r>
           </w:p>
         </w:tc>
@@ -3384,7 +3384,7 @@
                 <w:color w:val="243128"/>
                 <w:sz w:val="17"/>
               </w:rPr>
-              <w:t>TO DO</w:t>
+              <w:t>DONE</w:t>
             </w:r>
           </w:p>
         </w:tc>
@@ -3453,7 +3453,7 @@
                 <w:color w:val="243128"/>
                 <w:sz w:val="17"/>
               </w:rPr>
-              <w:t>TO DO</w:t>
+              <w:t>VALIDATE</w:t>
             </w:r>
           </w:p>
         </w:tc>
@@ -3560,7 +3560,7 @@
                 <w:color w:val="285A36"/>
                 <w:sz w:val="21"/>
               </w:rPr>
-              <w:t xml:space="preserve">APPROVAL CHECK  </w:t>
+              <w:t xml:space="preserve">APPROVAL CHECK  Implementation is approved. Close after five users edit a routine in under two minutes, understand suggested changes, and retain control of timing and intensity.</w:t>
             </w:r>
             <w:r>
               <w:rPr>
@@ -3568,7 +3568,7 @@
                 <w:color w:val="243128"/>
                 <w:sz w:val="21"/>
               </w:rPr>
-              <w:t>Proceed when users can adjust their routine in under two minutes, understand every suggested adaptation, and retain full control over timing and habit intensity.</w:t>
+              <w:t/>
             </w:r>
           </w:p>
         </w:tc>
@@ -3614,7 +3614,7 @@
           <w:color w:val="285A36"/>
           <w:sz w:val="21"/>
         </w:rPr>
-        <w:t xml:space="preserve">Status: </w:t>
+        <w:t xml:space="preserve">Status: DEFERRED - manual scheduling remains the complete baseline</w:t>
       </w:r>
       <w:r>
         <w:rPr>
@@ -3622,7 +3622,7 @@
           <w:color w:val="243128"/>
           <w:sz w:val="21"/>
         </w:rPr>
-        <w:t>DECISION REQUIRED - not a blocker for MVP or launch</w:t>
+        <w:t/>
       </w:r>
     </w:p>
     <w:p>
@@ -4939,7 +4939,7 @@
           <w:color w:val="285A36"/>
           <w:sz w:val="21"/>
         </w:rPr>
-        <w:t xml:space="preserve">Status: </w:t>
+        <w:t xml:space="preserve">Status: IN REVIEW - Android release verified; pilot gates remain</w:t>
       </w:r>
       <w:r>
         <w:rPr>
@@ -4947,7 +4947,7 @@
           <w:color w:val="243128"/>
           <w:sz w:val="21"/>
         </w:rPr>
-        <w:t>PENDING - calendar work may be included or skipped</w:t>
+        <w:t/>
       </w:r>
     </w:p>
     <w:p>
@@ -5110,7 +5110,7 @@
                 <w:color w:val="243128"/>
                 <w:sz w:val="17"/>
               </w:rPr>
-              <w:t>TO DO</w:t>
+              <w:t>IN REVIEW</w:t>
             </w:r>
           </w:p>
         </w:tc>
@@ -5152,7 +5152,7 @@
                 <w:color w:val="243128"/>
                 <w:sz w:val="17"/>
               </w:rPr>
-              <w:t>Screen reader, focus order, large text, contrast, reduced motion, touch targets, and one-handed use pass.</w:t>
+              <w:t>Semantics, reduced motion, 48-point targets, and release layouts are implemented. TalkBack, large text, contrast, and one-handed checks remain.</w:t>
             </w:r>
           </w:p>
         </w:tc>
@@ -5179,7 +5179,7 @@
                 <w:color w:val="243128"/>
                 <w:sz w:val="17"/>
               </w:rPr>
-              <w:t>TO DO</w:t>
+              <w:t>IN REVIEW</w:t>
             </w:r>
           </w:p>
         </w:tc>
@@ -5223,7 +5223,7 @@
                 <w:color w:val="243128"/>
                 <w:sz w:val="17"/>
               </w:rPr>
-              <w:t>Database migrations, corrupted-state recovery, notification recovery, and upgrade paths are tested.</w:t>
+              <w:t>Migration and integrity tests pass; encrypted data survived upgrade and restart. Forced corruption and notification-recovery checks remain.</w:t>
             </w:r>
           </w:p>
         </w:tc>
@@ -5249,7 +5249,7 @@
                 <w:color w:val="243128"/>
                 <w:sz w:val="17"/>
               </w:rPr>
-              <w:t>TO DO</w:t>
+              <w:t>IN REVIEW</w:t>
             </w:r>
           </w:p>
         </w:tc>
@@ -5291,7 +5291,7 @@
                 <w:color w:val="243128"/>
                 <w:sz w:val="17"/>
               </w:rPr>
-              <w:t>Target Android versions and at least one current iOS device/simulator pass core journeys.</w:t>
+              <w:t>The current Samsung Android release passed. API 24 and supported iOS coverage remain.</w:t>
             </w:r>
           </w:p>
         </w:tc>
@@ -5318,7 +5318,7 @@
                 <w:color w:val="243128"/>
                 <w:sz w:val="17"/>
               </w:rPr>
-              <w:t>TO DO</w:t>
+              <w:t>IN REVIEW</w:t>
             </w:r>
           </w:p>
         </w:tc>
@@ -5362,7 +5362,7 @@
                 <w:color w:val="243128"/>
                 <w:sz w:val="17"/>
               </w:rPr>
-              <w:t>Data inventory, retention, permissions, export/delete choices, and logs match the product promise.</w:t>
+              <w:t>Inventory, permission copy, JSON export, and two-stage deletion are implemented. Final deletion needs a disposable profile.</w:t>
             </w:r>
           </w:p>
         </w:tc>
@@ -5388,7 +5388,7 @@
                 <w:color w:val="243128"/>
                 <w:sz w:val="17"/>
               </w:rPr>
-              <w:t>TO DO</w:t>
+              <w:t>DONE</w:t>
             </w:r>
           </w:p>
         </w:tc>
@@ -5430,7 +5430,7 @@
                 <w:color w:val="243128"/>
                 <w:sz w:val="17"/>
               </w:rPr>
-              <w:t>Movement guidance has mobility alternatives, stop conditions, and a clear non-medical disclaimer.</w:t>
+              <w:t>Mobility alternatives, stop conditions, and a non-medical disclaimer pass review.</w:t>
             </w:r>
           </w:p>
         </w:tc>
@@ -5457,7 +5457,7 @@
                 <w:color w:val="243128"/>
                 <w:sz w:val="17"/>
               </w:rPr>
-              <w:t>TO DO</w:t>
+              <w:t>IN REVIEW</w:t>
             </w:r>
           </w:p>
         </w:tc>
@@ -5501,7 +5501,7 @@
                 <w:color w:val="243128"/>
                 <w:sz w:val="17"/>
               </w:rPr>
-              <w:t>Cold start, screen transitions, database operations, and reminder interactions meet agreed budgets.</w:t>
+              <w:t>Cold starts measured 479-555 ms versus a three-second budget. Other interaction timing remains a pilot check.</w:t>
             </w:r>
           </w:p>
         </w:tc>
@@ -5527,7 +5527,7 @@
                 <w:color w:val="243128"/>
                 <w:sz w:val="17"/>
               </w:rPr>
-              <w:t>TO DO</w:t>
+              <w:t>READY</w:t>
             </w:r>
           </w:p>
         </w:tc>
@@ -5569,7 +5569,7 @@
                 <w:color w:val="243128"/>
                 <w:sz w:val="17"/>
               </w:rPr>
-              <w:t>Signed Android and iOS builds reach approved testers through controlled channels.</w:t>
+              <w:t>EAS internal preview and its distribution checklist are ready; external builds await credential approval.</w:t>
             </w:r>
           </w:p>
         </w:tc>
@@ -5596,7 +5596,7 @@
                 <w:color w:val="243128"/>
                 <w:sz w:val="17"/>
               </w:rPr>
-              <w:t>TO DO</w:t>
+              <w:t>DONE</w:t>
             </w:r>
           </w:p>
         </w:tc>
@@ -5640,7 +5640,7 @@
                 <w:color w:val="243128"/>
                 <w:sz w:val="17"/>
               </w:rPr>
-              <w:t>Feedback intake, issue triage, severity rules, and rollback steps are documented.</w:t>
+              <w:t>The beta runbook covers tasks, intake, device coverage, severity, rollback, and exit criteria.</w:t>
             </w:r>
           </w:p>
         </w:tc>
@@ -9611,7 +9611,7 @@
                 <w:color w:val="285A36"/>
                 <w:sz w:val="21"/>
               </w:rPr>
-              <w:t xml:space="preserve">CONFIRM PHASE 3  </w:t>
+              <w:t xml:space="preserve">APPROVED NEXT PHASE  Defer Phase 5 calendar access. Proceed to Phase 6 quality hardening and private-beta preparation while completing the open Phase 3 reminder trial and Phase 4 five-user usability validation.</w:t>
             </w:r>
             <w:r>
               <w:rPr>
@@ -9619,7 +9619,7 @@
                 <w:color w:val="243128"/>
                 <w:sz w:val="21"/>
               </w:rPr>
-              <w:t>Approve detailed UX and implementation for reminder preferences, local notification scheduling, prompt actions, quiet hours, and pause controls. Calendar integration is deliberately excluded from this phase.</w:t>
+              <w:t/>
             </w:r>
           </w:p>
         </w:tc>
@@ -9653,7 +9653,7 @@
           <w:color w:val="667269"/>
           <w:sz w:val="18"/>
         </w:rPr>
-        <w:t>Document status: guidance baseline. Update checklist status and decision notes after every approved phase.</w:t>
+        <w:t>Document status: updated through Phase 6 review. Calendar deferred; reminder and usability trials remain open.</w:t>
       </w:r>
     </w:p>
     <w:sectPr>

</xml_diff>

<commit_message>
fix: complete Android accessibility hardening
</commit_message>
<xml_diff>
--- a/docs/Little-Gains-Product-Roadmap-and-Checklist.docx
+++ b/docs/Little-Gains-Product-Roadmap-and-Checklist.docx
@@ -237,7 +237,7 @@
               <w:rPr>
                 <w:sz w:val="19"/>
               </w:rPr>
-              <w:t>29 August 2026</w:t>
+              <w:t>30 August 2026</w:t>
             </w:r>
           </w:p>
         </w:tc>
@@ -4269,7 +4269,7 @@
               <w:rPr>
                 <w:sz w:val="17"/>
               </w:rPr>
-              <w:t>Semantics, reduced motion, 48-point targets, and release layouts are implemented. TalkBack, large text, contrast, and one-handed checks remain.</w:t>
+              <w:t>Large text through 150%, reduced motion, high-contrast text, 48-point targets, and practical one-handed reachability pass on the Samsung release build. TalkBack labels and the guided flow pass a device smoke check; human spoken-output and gesture validation remains.</w:t>
             </w:r>
           </w:p>
         </w:tc>

</xml_diff>